<commit_message>
docs: refine AI experience wording in CV
</commit_message>
<xml_diff>
--- a/Pablo_Rosas_CV_Bluetab.docx
+++ b/Pablo_Rosas_CV_Bluetab.docx
@@ -1,6 +1,6 @@
 
 <file path=word/document.xml><?xml version="1.0" encoding="utf-8"?>
-<w:document xmlns:mc="http://schemas.openxmlformats.org/markup-compatibility/2006" xmlns:o="urn:schemas-microsoft-com:office:office" xmlns:r="http://schemas.openxmlformats.org/officeDocument/2006/relationships" xmlns:m="http://schemas.openxmlformats.org/officeDocument/2006/math" xmlns:v="urn:schemas-microsoft-com:vml" xmlns:wp="http://schemas.openxmlformats.org/drawingml/2006/wordprocessingDrawing" xmlns:w10="urn:schemas-microsoft-com:office:word" xmlns:w="http://schemas.openxmlformats.org/wordprocessingml/2006/main" xmlns:wne="http://schemas.microsoft.com/office/word/2006/wordml" xmlns:sl="http://schemas.openxmlformats.org/schemaLibrary/2006/main" xmlns:a="http://schemas.openxmlformats.org/drawingml/2006/main" xmlns:pic="http://schemas.openxmlformats.org/drawingml/2006/picture" xmlns:c="http://schemas.openxmlformats.org/drawingml/2006/chart" xmlns:lc="http://schemas.openxmlformats.org/drawingml/2006/lockedCanvas" xmlns:dgm="http://schemas.openxmlformats.org/drawingml/2006/diagram" xmlns:wps="http://schemas.microsoft.com/office/word/2010/wordprocessingShape" xmlns:wpg="http://schemas.microsoft.com/office/word/2010/wordprocessingGroup" xmlns:w14="http://schemas.microsoft.com/office/word/2010/wordml" xmlns:w15="http://schemas.microsoft.com/office/word/2012/wordml" xmlns:w16="http://schemas.microsoft.com/office/word/2018/wordml" xmlns:w16cex="http://schemas.microsoft.com/office/word/2018/wordml/cex" xmlns:w16cid="http://schemas.microsoft.com/office/word/2016/wordml/cid" xmlns="http://schemas.microsoft.com/office/tasks/2019/documenttasks" xmlns:cr="http://schemas.microsoft.com/office/comments/2020/reactions">
+<w:document xmlns:ns2="http://schemas.openxmlformats.org/markup-compatibility/2006" xmlns:ns3="http://schemas.openxmlformats.org/drawingml/2006/wordprocessingDrawing" xmlns:ns4="http://schemas.openxmlformats.org/drawingml/2006/main" xmlns:ns5="http://schemas.microsoft.com/office/word/2010/wordprocessingShape" xmlns:ns6="http://schemas.openxmlformats.org/drawingml/2006/picture" xmlns:ns7="http://schemas.openxmlformats.org/officeDocument/2006/relationships" xmlns:w="http://schemas.openxmlformats.org/wordprocessingml/2006/main" xmlns:w14="http://schemas.microsoft.com/office/word/2010/wordml">
   <w:body>
     <w:p>
       <w:pPr>
@@ -116,7 +116,7 @@
           <w:szCs w:val="16"/>
           <w:rtl w:val="0"/>
         </w:rPr>
-        <w:t xml:space="preserve">Ingeniero en Sistemas Computacionales con experiencia en el desarrollo de aplicaciones móviles, web y microservicios. Enfocado en optimizar el desarrollo y facilitar el mantenimiento de soluciones eficientes, utilizando metodologías ágiles para garantizar la entrega de productos de alta calidad y seguridad. Con habilidades en patrones y buenas prácticas, capaz de trabajar en equipo y colaborar en proyectos multidisciplinarios para alcanzar objetivos de negocio de manera efectiva.</w:t>
+        <w:t xml:space="preserve">Ingeniero en Sistemas Computacionales y Backend Java con experiencia en el desarrollo de aplicaciones móviles, web y microservicios. Recientemente he incorporado soluciones de Generative AI y AI Integration en proyectos propios, diseñando e integrando AI APIs como Anthropic Claude sobre Java 17 + Spring Boot para habilitar un asistente de Conversational AI con Tool Calling y acceso a información operativa en tiempo real. Enfocado en construir soluciones mantenibles, seguras y alineadas a objetivos de negocio, aplicando buenas prácticas, trabajo colaborativo y metodologías ágiles.</w:t>
       </w:r>
       <w:r>
         <w:rPr>
@@ -155,107 +155,107 @@
         </w:rPr>
       </w:r>
       <w:r>
-        <mc:AlternateContent>
-          <mc:Choice Requires="wps">
+        <ns2:AlternateContent>
+          <ns2:Choice Requires="wps">
             <w:drawing>
-              <wp:anchor allowOverlap="1" behindDoc="0" distB="0" distT="0" distL="0" distR="0" hidden="0" layoutInCell="1" locked="0" relativeHeight="0" simplePos="0">
-                <wp:simplePos x="0" y="0"/>
-                <wp:positionH relativeFrom="column">
-                  <wp:posOffset>0</wp:posOffset>
-                </wp:positionH>
-                <wp:positionV relativeFrom="paragraph">
-                  <wp:posOffset>635</wp:posOffset>
-                </wp:positionV>
-                <wp:extent cx="6156960" cy="12700"/>
-                <wp:effectExtent b="0" l="0" r="0" t="0"/>
-                <wp:wrapTopAndBottom distB="0" distT="0"/>
-                <wp:docPr id="1" name=""/>
-                <a:graphic>
-                  <a:graphicData uri="http://schemas.microsoft.com/office/word/2010/wordprocessingShape">
-                    <wps:wsp>
-                      <wps:cNvSpPr/>
-                      <wps:cNvPr id="2" name="Shape 2"/>
-                      <wps:spPr>
-                        <a:xfrm>
-                          <a:off x="2267520" y="3779365"/>
-                          <a:ext cx="6156960" cy="1270"/>
-                        </a:xfrm>
-                        <a:custGeom>
-                          <a:rect b="b" l="l" r="r" t="t"/>
-                          <a:pathLst>
-                            <a:path extrusionOk="0" h="120000" w="9696">
-                              <a:moveTo>
-                                <a:pt x="0" y="0"/>
-                              </a:moveTo>
-                              <a:lnTo>
-                                <a:pt x="9696" y="0"/>
-                              </a:lnTo>
-                            </a:path>
-                          </a:pathLst>
-                        </a:custGeom>
-                        <a:noFill/>
-                        <a:ln cap="flat" cmpd="sng" w="9525">
-                          <a:solidFill>
-                            <a:srgbClr val="F6C5AB"/>
-                          </a:solidFill>
-                          <a:prstDash val="solid"/>
-                          <a:round/>
-                          <a:headEnd len="med" w="med" type="none"/>
-                          <a:tailEnd len="med" w="med" type="none"/>
-                        </a:ln>
-                      </wps:spPr>
-                      <wps:bodyPr anchorCtr="0" anchor="ctr" bIns="91425" lIns="91425" spcFirstLastPara="1" rIns="91425" wrap="square" tIns="91425">
-                        <a:noAutofit/>
-                      </wps:bodyPr>
-                    </wps:wsp>
-                  </a:graphicData>
-                </a:graphic>
-              </wp:anchor>
+              <ns3:anchor allowOverlap="1" behindDoc="0" distB="0" distT="0" distL="0" distR="0" hidden="0" layoutInCell="1" locked="0" relativeHeight="0" simplePos="0">
+                <ns3:simplePos x="0" y="0"/>
+                <ns3:positionH relativeFrom="column">
+                  <ns3:posOffset>0</ns3:posOffset>
+                </ns3:positionH>
+                <ns3:positionV relativeFrom="paragraph">
+                  <ns3:posOffset>635</ns3:posOffset>
+                </ns3:positionV>
+                <ns3:extent cx="6156960" cy="12700"/>
+                <ns3:effectExtent b="0" l="0" r="0" t="0"/>
+                <ns3:wrapTopAndBottom distB="0" distT="0"/>
+                <ns3:docPr id="1" name=""/>
+                <ns4:graphic>
+                  <ns4:graphicData uri="http://schemas.microsoft.com/office/word/2010/wordprocessingShape">
+                    <ns5:wsp>
+                      <ns5:cNvSpPr/>
+                      <ns5:cNvPr id="2" name="Shape 2"/>
+                      <ns5:spPr>
+                        <ns4:xfrm>
+                          <ns4:off x="2267520" y="3779365"/>
+                          <ns4:ext cx="6156960" cy="1270"/>
+                        </ns4:xfrm>
+                        <ns4:custGeom>
+                          <ns4:rect b="b" l="l" r="r" t="t"/>
+                          <ns4:pathLst>
+                            <ns4:path extrusionOk="0" h="120000" w="9696">
+                              <ns4:moveTo>
+                                <ns4:pt x="0" y="0"/>
+                              </ns4:moveTo>
+                              <ns4:lnTo>
+                                <ns4:pt x="9696" y="0"/>
+                              </ns4:lnTo>
+                            </ns4:path>
+                          </ns4:pathLst>
+                        </ns4:custGeom>
+                        <ns4:noFill/>
+                        <ns4:ln cap="flat" cmpd="sng" w="9525">
+                          <ns4:solidFill>
+                            <ns4:srgbClr val="F6C5AB"/>
+                          </ns4:solidFill>
+                          <ns4:prstDash val="solid"/>
+                          <ns4:round/>
+                          <ns4:headEnd len="med" w="med" type="none"/>
+                          <ns4:tailEnd len="med" w="med" type="none"/>
+                        </ns4:ln>
+                      </ns5:spPr>
+                      <ns5:bodyPr anchorCtr="0" anchor="ctr" bIns="91425" lIns="91425" spcFirstLastPara="1" rIns="91425" wrap="square" tIns="91425">
+                        <ns4:noAutofit/>
+                      </ns5:bodyPr>
+                    </ns5:wsp>
+                  </ns4:graphicData>
+                </ns4:graphic>
+              </ns3:anchor>
             </w:drawing>
-          </mc:Choice>
-          <mc:Fallback>
+          </ns2:Choice>
+          <ns2:Fallback>
             <w:drawing>
-              <wp:anchor allowOverlap="1" behindDoc="0" distB="0" distT="0" distL="0" distR="0" hidden="0" layoutInCell="1" locked="0" relativeHeight="0" simplePos="0">
-                <wp:simplePos x="0" y="0"/>
-                <wp:positionH relativeFrom="column">
-                  <wp:posOffset>0</wp:posOffset>
-                </wp:positionH>
-                <wp:positionV relativeFrom="paragraph">
-                  <wp:posOffset>635</wp:posOffset>
-                </wp:positionV>
-                <wp:extent cx="6156960" cy="12700"/>
-                <wp:effectExtent b="0" l="0" r="0" t="0"/>
-                <wp:wrapTopAndBottom distB="0" distT="0"/>
-                <wp:docPr id="1" name="image4.png"/>
-                <a:graphic>
-                  <a:graphicData uri="http://schemas.openxmlformats.org/drawingml/2006/picture">
-                    <pic:pic>
-                      <pic:nvPicPr>
-                        <pic:cNvPr id="0" name="image4.png"/>
-                        <pic:cNvPicPr preferRelativeResize="0"/>
-                      </pic:nvPicPr>
-                      <pic:blipFill>
-                        <a:blip r:embed="rId7"/>
-                        <a:srcRect/>
-                        <a:stretch>
-                          <a:fillRect/>
-                        </a:stretch>
-                      </pic:blipFill>
-                      <pic:spPr>
-                        <a:xfrm>
-                          <a:off x="0" y="0"/>
-                          <a:ext cx="6156960" cy="12700"/>
-                        </a:xfrm>
-                        <a:prstGeom prst="rect"/>
-                        <a:ln/>
-                      </pic:spPr>
-                    </pic:pic>
-                  </a:graphicData>
-                </a:graphic>
-              </wp:anchor>
+              <ns3:anchor allowOverlap="1" behindDoc="0" distB="0" distT="0" distL="0" distR="0" hidden="0" layoutInCell="1" locked="0" relativeHeight="0" simplePos="0">
+                <ns3:simplePos x="0" y="0"/>
+                <ns3:positionH relativeFrom="column">
+                  <ns3:posOffset>0</ns3:posOffset>
+                </ns3:positionH>
+                <ns3:positionV relativeFrom="paragraph">
+                  <ns3:posOffset>635</ns3:posOffset>
+                </ns3:positionV>
+                <ns3:extent cx="6156960" cy="12700"/>
+                <ns3:effectExtent b="0" l="0" r="0" t="0"/>
+                <ns3:wrapTopAndBottom distB="0" distT="0"/>
+                <ns3:docPr id="1" name="image4.png"/>
+                <ns4:graphic>
+                  <ns4:graphicData uri="http://schemas.openxmlformats.org/drawingml/2006/picture">
+                    <ns6:pic>
+                      <ns6:nvPicPr>
+                        <ns6:cNvPr id="0" name="image4.png"/>
+                        <ns6:cNvPicPr preferRelativeResize="0"/>
+                      </ns6:nvPicPr>
+                      <ns6:blipFill>
+                        <ns4:blip ns7:embed="rId7"/>
+                        <ns4:srcRect/>
+                        <ns4:stretch>
+                          <ns4:fillRect/>
+                        </ns4:stretch>
+                      </ns6:blipFill>
+                      <ns6:spPr>
+                        <ns4:xfrm>
+                          <ns4:off x="0" y="0"/>
+                          <ns4:ext cx="6156960" cy="12700"/>
+                        </ns4:xfrm>
+                        <ns4:prstGeom prst="rect"/>
+                        <ns4:ln/>
+                      </ns6:spPr>
+                    </ns6:pic>
+                  </ns4:graphicData>
+                </ns4:graphic>
+              </ns3:anchor>
             </w:drawing>
-          </mc:Fallback>
-        </mc:AlternateContent>
+          </ns2:Fallback>
+        </ns2:AlternateContent>
       </w:r>
     </w:p>
     <w:p>
@@ -723,107 +723,107 @@
         </w:rPr>
       </w:r>
       <w:r>
-        <mc:AlternateContent>
-          <mc:Choice Requires="wps">
+        <ns2:AlternateContent>
+          <ns2:Choice Requires="wps">
             <w:drawing>
-              <wp:anchor allowOverlap="1" behindDoc="0" distB="0" distT="0" distL="0" distR="0" hidden="0" layoutInCell="1" locked="0" relativeHeight="0" simplePos="0">
-                <wp:simplePos x="0" y="0"/>
-                <wp:positionH relativeFrom="column">
-                  <wp:posOffset>0</wp:posOffset>
-                </wp:positionH>
-                <wp:positionV relativeFrom="paragraph">
-                  <wp:posOffset>276225</wp:posOffset>
-                </wp:positionV>
-                <wp:extent cx="6149340" cy="12700"/>
-                <wp:effectExtent b="0" l="0" r="0" t="0"/>
-                <wp:wrapTopAndBottom distB="0" distT="0"/>
-                <wp:docPr id="3" name=""/>
-                <a:graphic>
-                  <a:graphicData uri="http://schemas.microsoft.com/office/word/2010/wordprocessingShape">
-                    <wps:wsp>
-                      <wps:cNvSpPr/>
-                      <wps:cNvPr id="4" name="Shape 4"/>
-                      <wps:spPr>
-                        <a:xfrm>
-                          <a:off x="2271330" y="3779365"/>
-                          <a:ext cx="6149340" cy="1270"/>
-                        </a:xfrm>
-                        <a:custGeom>
-                          <a:rect b="b" l="l" r="r" t="t"/>
-                          <a:pathLst>
-                            <a:path extrusionOk="0" h="120000" w="9684">
-                              <a:moveTo>
-                                <a:pt x="0" y="0"/>
-                              </a:moveTo>
-                              <a:lnTo>
-                                <a:pt x="9684" y="0"/>
-                              </a:lnTo>
-                            </a:path>
-                          </a:pathLst>
-                        </a:custGeom>
-                        <a:noFill/>
-                        <a:ln cap="flat" cmpd="sng" w="9525">
-                          <a:solidFill>
-                            <a:srgbClr val="F6C5AB"/>
-                          </a:solidFill>
-                          <a:prstDash val="solid"/>
-                          <a:round/>
-                          <a:headEnd len="med" w="med" type="none"/>
-                          <a:tailEnd len="med" w="med" type="none"/>
-                        </a:ln>
-                      </wps:spPr>
-                      <wps:bodyPr anchorCtr="0" anchor="ctr" bIns="91425" lIns="91425" spcFirstLastPara="1" rIns="91425" wrap="square" tIns="91425">
-                        <a:noAutofit/>
-                      </wps:bodyPr>
-                    </wps:wsp>
-                  </a:graphicData>
-                </a:graphic>
-              </wp:anchor>
+              <ns3:anchor allowOverlap="1" behindDoc="0" distB="0" distT="0" distL="0" distR="0" hidden="0" layoutInCell="1" locked="0" relativeHeight="0" simplePos="0">
+                <ns3:simplePos x="0" y="0"/>
+                <ns3:positionH relativeFrom="column">
+                  <ns3:posOffset>0</ns3:posOffset>
+                </ns3:positionH>
+                <ns3:positionV relativeFrom="paragraph">
+                  <ns3:posOffset>276225</ns3:posOffset>
+                </ns3:positionV>
+                <ns3:extent cx="6149340" cy="12700"/>
+                <ns3:effectExtent b="0" l="0" r="0" t="0"/>
+                <ns3:wrapTopAndBottom distB="0" distT="0"/>
+                <ns3:docPr id="3" name=""/>
+                <ns4:graphic>
+                  <ns4:graphicData uri="http://schemas.microsoft.com/office/word/2010/wordprocessingShape">
+                    <ns5:wsp>
+                      <ns5:cNvSpPr/>
+                      <ns5:cNvPr id="4" name="Shape 4"/>
+                      <ns5:spPr>
+                        <ns4:xfrm>
+                          <ns4:off x="2271330" y="3779365"/>
+                          <ns4:ext cx="6149340" cy="1270"/>
+                        </ns4:xfrm>
+                        <ns4:custGeom>
+                          <ns4:rect b="b" l="l" r="r" t="t"/>
+                          <ns4:pathLst>
+                            <ns4:path extrusionOk="0" h="120000" w="9684">
+                              <ns4:moveTo>
+                                <ns4:pt x="0" y="0"/>
+                              </ns4:moveTo>
+                              <ns4:lnTo>
+                                <ns4:pt x="9684" y="0"/>
+                              </ns4:lnTo>
+                            </ns4:path>
+                          </ns4:pathLst>
+                        </ns4:custGeom>
+                        <ns4:noFill/>
+                        <ns4:ln cap="flat" cmpd="sng" w="9525">
+                          <ns4:solidFill>
+                            <ns4:srgbClr val="F6C5AB"/>
+                          </ns4:solidFill>
+                          <ns4:prstDash val="solid"/>
+                          <ns4:round/>
+                          <ns4:headEnd len="med" w="med" type="none"/>
+                          <ns4:tailEnd len="med" w="med" type="none"/>
+                        </ns4:ln>
+                      </ns5:spPr>
+                      <ns5:bodyPr anchorCtr="0" anchor="ctr" bIns="91425" lIns="91425" spcFirstLastPara="1" rIns="91425" wrap="square" tIns="91425">
+                        <ns4:noAutofit/>
+                      </ns5:bodyPr>
+                    </ns5:wsp>
+                  </ns4:graphicData>
+                </ns4:graphic>
+              </ns3:anchor>
             </w:drawing>
-          </mc:Choice>
-          <mc:Fallback>
+          </ns2:Choice>
+          <ns2:Fallback>
             <w:drawing>
-              <wp:anchor allowOverlap="1" behindDoc="0" distB="0" distT="0" distL="0" distR="0" hidden="0" layoutInCell="1" locked="0" relativeHeight="0" simplePos="0">
-                <wp:simplePos x="0" y="0"/>
-                <wp:positionH relativeFrom="column">
-                  <wp:posOffset>0</wp:posOffset>
-                </wp:positionH>
-                <wp:positionV relativeFrom="paragraph">
-                  <wp:posOffset>276225</wp:posOffset>
-                </wp:positionV>
-                <wp:extent cx="6149340" cy="12700"/>
-                <wp:effectExtent b="0" l="0" r="0" t="0"/>
-                <wp:wrapTopAndBottom distB="0" distT="0"/>
-                <wp:docPr id="3" name="image6.png"/>
-                <a:graphic>
-                  <a:graphicData uri="http://schemas.openxmlformats.org/drawingml/2006/picture">
-                    <pic:pic>
-                      <pic:nvPicPr>
-                        <pic:cNvPr id="0" name="image6.png"/>
-                        <pic:cNvPicPr preferRelativeResize="0"/>
-                      </pic:nvPicPr>
-                      <pic:blipFill>
-                        <a:blip r:embed="rId7"/>
-                        <a:srcRect/>
-                        <a:stretch>
-                          <a:fillRect/>
-                        </a:stretch>
-                      </pic:blipFill>
-                      <pic:spPr>
-                        <a:xfrm>
-                          <a:off x="0" y="0"/>
-                          <a:ext cx="6149340" cy="12700"/>
-                        </a:xfrm>
-                        <a:prstGeom prst="rect"/>
-                        <a:ln/>
-                      </pic:spPr>
-                    </pic:pic>
-                  </a:graphicData>
-                </a:graphic>
-              </wp:anchor>
+              <ns3:anchor allowOverlap="1" behindDoc="0" distB="0" distT="0" distL="0" distR="0" hidden="0" layoutInCell="1" locked="0" relativeHeight="0" simplePos="0">
+                <ns3:simplePos x="0" y="0"/>
+                <ns3:positionH relativeFrom="column">
+                  <ns3:posOffset>0</ns3:posOffset>
+                </ns3:positionH>
+                <ns3:positionV relativeFrom="paragraph">
+                  <ns3:posOffset>276225</ns3:posOffset>
+                </ns3:positionV>
+                <ns3:extent cx="6149340" cy="12700"/>
+                <ns3:effectExtent b="0" l="0" r="0" t="0"/>
+                <ns3:wrapTopAndBottom distB="0" distT="0"/>
+                <ns3:docPr id="3" name="image6.png"/>
+                <ns4:graphic>
+                  <ns4:graphicData uri="http://schemas.openxmlformats.org/drawingml/2006/picture">
+                    <ns6:pic>
+                      <ns6:nvPicPr>
+                        <ns6:cNvPr id="0" name="image6.png"/>
+                        <ns6:cNvPicPr preferRelativeResize="0"/>
+                      </ns6:nvPicPr>
+                      <ns6:blipFill>
+                        <ns4:blip ns7:embed="rId7"/>
+                        <ns4:srcRect/>
+                        <ns4:stretch>
+                          <ns4:fillRect/>
+                        </ns4:stretch>
+                      </ns6:blipFill>
+                      <ns6:spPr>
+                        <ns4:xfrm>
+                          <ns4:off x="0" y="0"/>
+                          <ns4:ext cx="6149340" cy="12700"/>
+                        </ns4:xfrm>
+                        <ns4:prstGeom prst="rect"/>
+                        <ns4:ln/>
+                      </ns6:spPr>
+                    </ns6:pic>
+                  </ns4:graphicData>
+                </ns4:graphic>
+              </ns3:anchor>
             </w:drawing>
-          </mc:Fallback>
-        </mc:AlternateContent>
+          </ns2:Fallback>
+        </ns2:AlternateContent>
       </w:r>
     </w:p>
     <w:p>
@@ -2619,46 +2619,46 @@
         </w:rPr>
       </w:r>
       <w:r>
-        <mc:AlternateContent>
-          <mc:Choice Requires="wpg">
+        <ns2:AlternateContent>
+          <ns2:Choice Requires="wpg">
             <w:drawing>
-              <wp:anchor allowOverlap="1" behindDoc="0" distB="0" distT="0" distL="114300" distR="114300" hidden="0" layoutInCell="1" locked="0" relativeHeight="0" simplePos="0">
-                <wp:simplePos x="0" y="0"/>
-                <wp:positionH relativeFrom="column">
-                  <wp:posOffset>2831782</wp:posOffset>
-                </wp:positionH>
-                <wp:positionV relativeFrom="paragraph">
-                  <wp:posOffset>7725093</wp:posOffset>
-                </wp:positionV>
-                <wp:extent cx="2851785" cy="1228725"/>
-                <wp:effectExtent b="0" l="0" r="0" t="0"/>
-                <wp:wrapNone/>
-                <wp:docPr id="2" name=""/>
-                <a:graphic>
-                  <a:graphicData uri="http://schemas.microsoft.com/office/word/2010/wordprocessingShape">
-                    <wps:wsp>
-                      <wps:cNvSpPr/>
-                      <wps:cNvPr id="3" name="Shape 3"/>
-                      <wps:spPr>
-                        <a:xfrm>
-                          <a:off x="3924870" y="3170400"/>
-                          <a:ext cx="2842260" cy="1219200"/>
-                        </a:xfrm>
-                        <a:prstGeom prst="rect">
-                          <a:avLst/>
-                        </a:prstGeom>
-                        <a:noFill/>
-                        <a:ln cap="flat" cmpd="sng" w="9525">
-                          <a:solidFill>
-                            <a:srgbClr val="FF0000"/>
-                          </a:solidFill>
-                          <a:prstDash val="solid"/>
-                          <a:miter lim="8000"/>
-                          <a:headEnd len="sm" w="sm" type="none"/>
-                          <a:tailEnd len="sm" w="sm" type="none"/>
-                        </a:ln>
-                      </wps:spPr>
-                      <wps:txbx>
+              <ns3:anchor allowOverlap="1" behindDoc="0" distB="0" distT="0" distL="114300" distR="114300" hidden="0" layoutInCell="1" locked="0" relativeHeight="0" simplePos="0">
+                <ns3:simplePos x="0" y="0"/>
+                <ns3:positionH relativeFrom="column">
+                  <ns3:posOffset>2831782</ns3:posOffset>
+                </ns3:positionH>
+                <ns3:positionV relativeFrom="paragraph">
+                  <ns3:posOffset>7725093</ns3:posOffset>
+                </ns3:positionV>
+                <ns3:extent cx="2851785" cy="1228725"/>
+                <ns3:effectExtent b="0" l="0" r="0" t="0"/>
+                <ns3:wrapNone/>
+                <ns3:docPr id="2" name=""/>
+                <ns4:graphic>
+                  <ns4:graphicData uri="http://schemas.microsoft.com/office/word/2010/wordprocessingShape">
+                    <ns5:wsp>
+                      <ns5:cNvSpPr/>
+                      <ns5:cNvPr id="3" name="Shape 3"/>
+                      <ns5:spPr>
+                        <ns4:xfrm>
+                          <ns4:off x="3924870" y="3170400"/>
+                          <ns4:ext cx="2842260" cy="1219200"/>
+                        </ns4:xfrm>
+                        <ns4:prstGeom prst="rect">
+                          <ns4:avLst/>
+                        </ns4:prstGeom>
+                        <ns4:noFill/>
+                        <ns4:ln cap="flat" cmpd="sng" w="9525">
+                          <ns4:solidFill>
+                            <ns4:srgbClr val="FF0000"/>
+                          </ns4:solidFill>
+                          <ns4:prstDash val="solid"/>
+                          <ns4:miter lim="8000"/>
+                          <ns4:headEnd len="sm" w="sm" type="none"/>
+                          <ns4:tailEnd len="sm" w="sm" type="none"/>
+                        </ns4:ln>
+                      </ns5:spPr>
+                      <ns5:txbx>
                         <w:txbxContent>
                           <w:p>
                             <w:pPr>
@@ -2682,59 +2682,59 @@
                             </w:r>
                           </w:p>
                         </w:txbxContent>
-                      </wps:txbx>
-                      <wps:bodyPr anchorCtr="0" anchor="t" bIns="0" lIns="0" spcFirstLastPara="1" rIns="0" wrap="square" tIns="0">
-                        <a:noAutofit/>
-                      </wps:bodyPr>
-                    </wps:wsp>
-                  </a:graphicData>
-                </a:graphic>
-              </wp:anchor>
+                      </ns5:txbx>
+                      <ns5:bodyPr anchorCtr="0" anchor="t" bIns="0" lIns="0" spcFirstLastPara="1" rIns="0" wrap="square" tIns="0">
+                        <ns4:noAutofit/>
+                      </ns5:bodyPr>
+                    </ns5:wsp>
+                  </ns4:graphicData>
+                </ns4:graphic>
+              </ns3:anchor>
             </w:drawing>
-          </mc:Choice>
-          <mc:Fallback>
+          </ns2:Choice>
+          <ns2:Fallback>
             <w:drawing>
-              <wp:anchor allowOverlap="1" behindDoc="0" distB="0" distT="0" distL="114300" distR="114300" hidden="0" layoutInCell="1" locked="0" relativeHeight="0" simplePos="0">
-                <wp:simplePos x="0" y="0"/>
-                <wp:positionH relativeFrom="column">
-                  <wp:posOffset>2831782</wp:posOffset>
-                </wp:positionH>
-                <wp:positionV relativeFrom="paragraph">
-                  <wp:posOffset>7725093</wp:posOffset>
-                </wp:positionV>
-                <wp:extent cx="2851785" cy="1228725"/>
-                <wp:effectExtent b="0" l="0" r="0" t="0"/>
-                <wp:wrapNone/>
-                <wp:docPr id="2" name="image5.png"/>
-                <a:graphic>
-                  <a:graphicData uri="http://schemas.openxmlformats.org/drawingml/2006/picture">
-                    <pic:pic>
-                      <pic:nvPicPr>
-                        <pic:cNvPr id="0" name="image5.png"/>
-                        <pic:cNvPicPr preferRelativeResize="0"/>
-                      </pic:nvPicPr>
-                      <pic:blipFill>
-                        <a:blip r:embed="rId7"/>
-                        <a:srcRect/>
-                        <a:stretch>
-                          <a:fillRect/>
-                        </a:stretch>
-                      </pic:blipFill>
-                      <pic:spPr>
-                        <a:xfrm>
-                          <a:off x="0" y="0"/>
-                          <a:ext cx="2851785" cy="1228725"/>
-                        </a:xfrm>
-                        <a:prstGeom prst="rect"/>
-                        <a:ln/>
-                      </pic:spPr>
-                    </pic:pic>
-                  </a:graphicData>
-                </a:graphic>
-              </wp:anchor>
+              <ns3:anchor allowOverlap="1" behindDoc="0" distB="0" distT="0" distL="114300" distR="114300" hidden="0" layoutInCell="1" locked="0" relativeHeight="0" simplePos="0">
+                <ns3:simplePos x="0" y="0"/>
+                <ns3:positionH relativeFrom="column">
+                  <ns3:posOffset>2831782</ns3:posOffset>
+                </ns3:positionH>
+                <ns3:positionV relativeFrom="paragraph">
+                  <ns3:posOffset>7725093</ns3:posOffset>
+                </ns3:positionV>
+                <ns3:extent cx="2851785" cy="1228725"/>
+                <ns3:effectExtent b="0" l="0" r="0" t="0"/>
+                <ns3:wrapNone/>
+                <ns3:docPr id="2" name="image5.png"/>
+                <ns4:graphic>
+                  <ns4:graphicData uri="http://schemas.openxmlformats.org/drawingml/2006/picture">
+                    <ns6:pic>
+                      <ns6:nvPicPr>
+                        <ns6:cNvPr id="0" name="image5.png"/>
+                        <ns6:cNvPicPr preferRelativeResize="0"/>
+                      </ns6:nvPicPr>
+                      <ns6:blipFill>
+                        <ns4:blip ns7:embed="rId7"/>
+                        <ns4:srcRect/>
+                        <ns4:stretch>
+                          <ns4:fillRect/>
+                        </ns4:stretch>
+                      </ns6:blipFill>
+                      <ns6:spPr>
+                        <ns4:xfrm>
+                          <ns4:off x="0" y="0"/>
+                          <ns4:ext cx="2851785" cy="1228725"/>
+                        </ns4:xfrm>
+                        <ns4:prstGeom prst="rect"/>
+                        <ns4:ln/>
+                      </ns6:spPr>
+                    </ns6:pic>
+                  </ns4:graphicData>
+                </ns4:graphic>
+              </ns3:anchor>
             </w:drawing>
-          </mc:Fallback>
-        </mc:AlternateContent>
+          </ns2:Fallback>
+        </ns2:AlternateContent>
       </w:r>
     </w:p>
     <w:p>
@@ -2795,7 +2795,7 @@
         </w:rPr>
         <w:t xml:space="preserve">2026 – actualidad</w:t>
         <w:br w:type="textWrapping"/>
-        <w:t xml:space="preserve">Plataforma de rastreo GPS y gestión de flotillas vehiculares con asistente de IA</w:t>
+        <w:t xml:space="preserve">Plataforma de rastreo GPS y gestión de flotillas vehiculares con asistente conversacional integrado con Anthropic Claude</w:t>
         <w:br w:type="textWrapping"/>
         <w:t xml:space="preserve">Funciones:</w:t>
       </w:r>
@@ -2860,7 +2860,7 @@
               <w:vertAlign w:val="baseline"/>
               <w:rtl w:val="0"/>
             </w:rPr>
-            <w:t xml:space="preserve">Diseño e implementación de backend en Java 17 / Spring Boot como monolito modular (auth, users, telemetry, tracking, chat), con arquitectura Controller → Service → Repository y separación clara de dominios.</w:t>
+            <w:t xml:space="preserve">Diseño e implementación de backend en Java 17 / Spring Boot como monolito modular (auth, users, telemetry, tracking, chat), incluyendo la integración entre el backend y la API de Anthropic Claude para habilitar funcionalidades de Generative AI.</w:t>
           </w:r>
         </w:sdtContent>
       </w:sdt>
@@ -3033,7 +3033,7 @@
           <w:vertAlign w:val="baseline"/>
           <w:rtl w:val="0"/>
         </w:rPr>
-        <w:t xml:space="preserve">Integración de un asistente conversacional con la API de Anthropic (Claude), capaz de responder preguntas en lenguaje natural sobre la flota usando tool calling y datos en tiempo real.</w:t>
+        <w:t xml:space="preserve">Diseño e implementación de un asistente conversacional con Anthropic Claude, incluyendo Tool Calling para consultar desde el backend dispositivos, posiciones GPS, rutas y telemetría en tiempo real, respondiendo con datos reales almacenados en el sistema.</w:t>
       </w:r>
     </w:p>
     <w:p>
@@ -3147,7 +3147,7 @@
           <w:vertAlign w:val="baseline"/>
           <w:rtl w:val="0"/>
         </w:rPr>
-        <w:t xml:space="preserve">App móvil en Flutter/Dart con mapa en tiempo real (Google Maps), rutas, marcadores personalizados y chat con el asistente IA.</w:t>
+        <w:t xml:space="preserve">Construcción del flujo end-to-end entre la app móvil en Flutter/Dart, el backend y Anthropic Claude, con mapa en tiempo real (Google Maps), rutas, marcadores personalizados y chat con el asistente.</w:t>
       </w:r>
     </w:p>
     <w:p>
@@ -4160,12 +4160,12 @@
       </w:r>
     </w:p>
     <w:sectPr>
-      <w:headerReference r:id="rId8" w:type="default"/>
-      <w:headerReference r:id="rId9" w:type="first"/>
-      <w:headerReference r:id="rId10" w:type="even"/>
-      <w:footerReference r:id="rId11" w:type="default"/>
-      <w:footerReference r:id="rId12" w:type="first"/>
-      <w:footerReference r:id="rId13" w:type="even"/>
+      <w:headerReference ns7:id="rId8" w:type="default"/>
+      <w:headerReference ns7:id="rId9" w:type="first"/>
+      <w:headerReference ns7:id="rId10" w:type="even"/>
+      <w:footerReference ns7:id="rId11" w:type="default"/>
+      <w:footerReference ns7:id="rId12" w:type="first"/>
+      <w:footerReference ns7:id="rId13" w:type="even"/>
       <w:pgSz w:h="15840" w:w="12240" w:orient="portrait"/>
       <w:pgMar w:bottom="1417" w:top="1417" w:left="1701" w:right="1701" w:header="708" w:footer="708"/>
       <w:pgNumType w:start="1"/>

</xml_diff>